<commit_message>
Hardware and Electronic Changes 1/22/2026
</commit_message>
<xml_diff>
--- a/Paper/Method 1_15_2026/Design Optimization Strategy.docx
+++ b/Paper/Method 1_15_2026/Design Optimization Strategy.docx
@@ -113,13 +113,7 @@
           <w:rPr>
             <w:rFonts w:ascii="Cambria Math" w:hAnsi="Cambria Math"/>
           </w:rPr>
-          <m:t>F</m:t>
-        </m:r>
-        <m:r>
-          <w:rPr>
-            <w:rFonts w:ascii="Cambria Math" w:hAnsi="Cambria Math"/>
-          </w:rPr>
-          <m:t>=[</m:t>
+          <m:t>F=[</m:t>
         </m:r>
         <m:sSub>
           <m:sSubPr>
@@ -766,6 +760,9 @@
             </m:e>
           </m:rad>
           <m:r>
+            <m:rPr>
+              <m:sty m:val="p"/>
+            </m:rPr>
             <w:br/>
           </m:r>
         </m:oMath>
@@ -786,15 +783,7 @@
         <w:t xml:space="preserve">, </w:t>
       </w:r>
       <w:r>
-        <w:t xml:space="preserve">can theoretically be calibrated out in software. Random noise, however, represents the fundamental "blur" or uncertainty limit of the hardware that cannot be removed. By treating hysteresis and angle variation as random noise, we ensure the optimization targets a design that is robust even when the system behaves unpredictably. This normalization converts the singular value into a unitless Signal-to-Noise Ratio (SNR). </w:t>
-      </w:r>
-      <w:proofErr w:type="gramStart"/>
-      <w:r>
-        <w:t>A value</w:t>
-      </w:r>
-      <w:proofErr w:type="gramEnd"/>
-      <w:r>
-        <w:t xml:space="preserve"> of </w:t>
+        <w:t xml:space="preserve">can theoretically be calibrated out in software. Random noise, however, represents the fundamental "blur" or uncertainty limit of the hardware that cannot be removed. By treating hysteresis and angle variation as random noise, we ensure the optimization targets a design that is robust even when the system behaves unpredictably. This normalization converts the singular value into a unitless Signal-to-Noise Ratio (SNR). A value of </w:t>
       </w:r>
       <m:oMath>
         <m:sSub>
@@ -888,16 +877,7 @@
           <w:rPr>
             <w:rFonts w:ascii="Cambria Math" w:hAnsi="Cambria Math"/>
           </w:rPr>
-          <m:t>&gt;</m:t>
-        </m:r>
-        <m:r>
-          <m:rPr>
-            <m:sty m:val="bi"/>
-          </m:rPr>
-          <w:rPr>
-            <w:rFonts w:ascii="Cambria Math" w:hAnsi="Cambria Math"/>
-          </w:rPr>
-          <m:t>1</m:t>
+          <m:t>&gt;1</m:t>
         </m:r>
       </m:oMath>
       <w:r>
@@ -944,16 +924,7 @@
           <w:rPr>
             <w:rFonts w:ascii="Cambria Math" w:hAnsi="Cambria Math"/>
           </w:rPr>
-          <m:t>≈</m:t>
-        </m:r>
-        <m:r>
-          <m:rPr>
-            <m:sty m:val="bi"/>
-          </m:rPr>
-          <w:rPr>
-            <w:rFonts w:ascii="Cambria Math" w:hAnsi="Cambria Math"/>
-          </w:rPr>
-          <m:t>1</m:t>
+          <m:t>≈1</m:t>
         </m:r>
       </m:oMath>
       <w:r>
@@ -1045,15 +1016,7 @@
     </w:p>
     <w:p>
       <w:r>
-        <w:t xml:space="preserve">Second, we rejected strict rubrics like fixing the </w:t>
-      </w:r>
-      <w:proofErr w:type="gramStart"/>
-      <w:r>
-        <w:t>worst-case</w:t>
-      </w:r>
-      <w:proofErr w:type="gramEnd"/>
-      <w:r>
-        <w:t xml:space="preserve"> (or Log-Sum). These follow a "weakest link" philosophy: they force the optimizer to focus entirely on the absolute lowest score. In our system, the lowest scores naturally occur at very small force separations where </w:t>
+        <w:t xml:space="preserve">Second, we rejected strict rubrics like fixing the worst-case (or Log-Sum). These follow a "weakest link" philosophy: they force the optimizer to focus entirely on the absolute lowest score. In our system, the lowest scores naturally occur at very small force separations where </w:t>
       </w:r>
       <w:r>
         <w:t>physics</w:t>
@@ -1062,6 +1025,9 @@
         <w:t xml:space="preserve"> makes high accuracy impossible. If we used these methods, the optimizer would waste 100% of its effort trying to squeeze a tiny improvement out of these "dead zones," while ignoring the rest of the workspace.</w:t>
       </w:r>
     </w:p>
+    <w:p/>
+    <w:p/>
+    <w:p/>
     <w:p>
       <w:r>
         <w:rPr>
@@ -1069,13 +1035,13 @@
         </w:rPr>
         <w:lastRenderedPageBreak/>
         <w:drawing>
-          <wp:anchor distT="0" distB="0" distL="114300" distR="114300" simplePos="0" relativeHeight="251658240" behindDoc="1" locked="0" layoutInCell="1" allowOverlap="1" wp14:anchorId="30504BC2" wp14:editId="28D75A17">
+          <wp:anchor distT="0" distB="0" distL="114300" distR="114300" simplePos="0" relativeHeight="251658240" behindDoc="1" locked="0" layoutInCell="1" allowOverlap="1" wp14:anchorId="30504BC2" wp14:editId="11D203AC">
             <wp:simplePos x="0" y="0"/>
             <wp:positionH relativeFrom="margin">
               <wp:align>center</wp:align>
             </wp:positionH>
             <wp:positionV relativeFrom="paragraph">
-              <wp:posOffset>200025</wp:posOffset>
+              <wp:posOffset>0</wp:posOffset>
             </wp:positionV>
             <wp:extent cx="5353050" cy="3211830"/>
             <wp:effectExtent l="0" t="0" r="0" b="7620"/>
@@ -1135,22 +1101,175 @@
       <w:r>
         <w:t>By contrast, our Sigmoid function acts as a strategic filter.</w:t>
       </w:r>
+      <w:r>
+        <w:t xml:space="preserve"> </w:t>
+      </w:r>
+      <w:r>
+        <w:t>Physically, it is an "S-shaped" curve centered exactly at our critical SNR threshold of 1.0. The curve is steep in the middle (roughly between SNR 0.5 and 2.0) but flattens out at the top and bottom. Because the curve is flat at the bottom, it ignores the "lost causes" (impossible small separations). Because it is flat at the top, it ignores the "safe wins" (easy large separations). Instead, the steep middle section forces the optimizer to spend its budget exclusively on the "transition zone"</w:t>
+      </w:r>
+      <w:r>
+        <w:t xml:space="preserve">, </w:t>
+      </w:r>
+      <w:r>
+        <w:t>those cases right on the edge of becoming observable. This ensures the design maximizes the total number of usable configurations, rather than futilely fighting physics to fix a dead zone</w:t>
+      </w:r>
+      <w:r>
+        <w:t>.</w:t>
+      </w:r>
     </w:p>
+    <w:p/>
+    <w:p/>
+    <w:p/>
+    <w:p/>
+    <w:p/>
+    <w:p/>
+    <w:p/>
+    <w:p/>
+    <w:p/>
     <w:p>
       <w:r>
-        <w:t>Physically, it is an "S-shaped" curve centered exactly at our critical SNR threshold of 1.0. The curve is steep in the middle (roughly between SNR 0.5 and 2.0) but flattens out at the top and bottom. Because the curve is flat at the bottom, it ignores the "lost causes" (impossible small separations). Because it is flat at the top, it ignores the "safe wins" (easy large separations). Instead, the steep middle section forces the optimizer to spend its budget exclusively on the "transition zone"</w:t>
-      </w:r>
-      <w:r>
-        <w:t xml:space="preserve">, </w:t>
-      </w:r>
-      <w:r>
-        <w:t>those cases right on the edge of becoming observable. This ensures the design maximizes the total number of usable configurations, rather than futilely fighting physics to fix a dead zone</w:t>
-      </w:r>
-      <w:r>
-        <w:t>.</w:t>
+        <w:lastRenderedPageBreak/>
+        <w:drawing>
+          <wp:anchor distT="0" distB="0" distL="114300" distR="114300" simplePos="0" relativeHeight="251660288" behindDoc="1" locked="0" layoutInCell="1" allowOverlap="1" wp14:anchorId="38B668BA" wp14:editId="15D2BA5B">
+            <wp:simplePos x="0" y="0"/>
+            <wp:positionH relativeFrom="margin">
+              <wp:align>center</wp:align>
+            </wp:positionH>
+            <wp:positionV relativeFrom="paragraph">
+              <wp:posOffset>0</wp:posOffset>
+            </wp:positionV>
+            <wp:extent cx="6607175" cy="5695950"/>
+            <wp:effectExtent l="0" t="0" r="3175" b="0"/>
+            <wp:wrapTight wrapText="bothSides">
+              <wp:wrapPolygon edited="0">
+                <wp:start x="0" y="0"/>
+                <wp:lineTo x="0" y="21528"/>
+                <wp:lineTo x="21548" y="21528"/>
+                <wp:lineTo x="21548" y="0"/>
+                <wp:lineTo x="0" y="0"/>
+              </wp:wrapPolygon>
+            </wp:wrapTight>
+            <wp:docPr id="135052588" name="Picture 1"/>
+            <wp:cNvGraphicFramePr>
+              <a:graphicFrameLocks xmlns:a="http://schemas.openxmlformats.org/drawingml/2006/main" noChangeAspect="1"/>
+            </wp:cNvGraphicFramePr>
+            <a:graphic xmlns:a="http://schemas.openxmlformats.org/drawingml/2006/main">
+              <a:graphicData uri="http://schemas.openxmlformats.org/drawingml/2006/picture">
+                <pic:pic xmlns:pic="http://schemas.openxmlformats.org/drawingml/2006/picture">
+                  <pic:nvPicPr>
+                    <pic:cNvPr id="135052588" name=""/>
+                    <pic:cNvPicPr/>
+                  </pic:nvPicPr>
+                  <pic:blipFill>
+                    <a:blip r:embed="rId6">
+                      <a:extLst>
+                        <a:ext uri="{28A0092B-C50C-407E-A947-70E740481C1C}">
+                          <a14:useLocalDpi xmlns:a14="http://schemas.microsoft.com/office/drawing/2010/main" val="0"/>
+                        </a:ext>
+                      </a:extLst>
+                    </a:blip>
+                    <a:stretch>
+                      <a:fillRect/>
+                    </a:stretch>
+                  </pic:blipFill>
+                  <pic:spPr>
+                    <a:xfrm>
+                      <a:off x="0" y="0"/>
+                      <a:ext cx="6607175" cy="5695950"/>
+                    </a:xfrm>
+                    <a:prstGeom prst="rect">
+                      <a:avLst/>
+                    </a:prstGeom>
+                  </pic:spPr>
+                </pic:pic>
+              </a:graphicData>
+            </a:graphic>
+            <wp14:sizeRelH relativeFrom="page">
+              <wp14:pctWidth>0</wp14:pctWidth>
+            </wp14:sizeRelH>
+            <wp14:sizeRelV relativeFrom="page">
+              <wp14:pctHeight>0</wp14:pctHeight>
+            </wp14:sizeRelV>
+          </wp:anchor>
+        </w:drawing>
       </w:r>
     </w:p>
+    <w:p/>
+    <w:p/>
+    <w:p/>
+    <w:p/>
+    <w:p/>
+    <w:p/>
     <w:p>
+      <w:r>
+        <w:rPr>
+          <w:noProof/>
+        </w:rPr>
+        <w:lastRenderedPageBreak/>
+        <w:drawing>
+          <wp:anchor distT="0" distB="0" distL="114300" distR="114300" simplePos="0" relativeHeight="251659264" behindDoc="1" locked="0" layoutInCell="1" allowOverlap="1" wp14:anchorId="12F00EB4" wp14:editId="1CD40672">
+            <wp:simplePos x="0" y="0"/>
+            <wp:positionH relativeFrom="margin">
+              <wp:align>center</wp:align>
+            </wp:positionH>
+            <wp:positionV relativeFrom="paragraph">
+              <wp:posOffset>1143000</wp:posOffset>
+            </wp:positionV>
+            <wp:extent cx="5406390" cy="6953250"/>
+            <wp:effectExtent l="0" t="0" r="3810" b="0"/>
+            <wp:wrapTight wrapText="bothSides">
+              <wp:wrapPolygon edited="0">
+                <wp:start x="0" y="0"/>
+                <wp:lineTo x="0" y="21541"/>
+                <wp:lineTo x="21539" y="21541"/>
+                <wp:lineTo x="21539" y="0"/>
+                <wp:lineTo x="0" y="0"/>
+              </wp:wrapPolygon>
+            </wp:wrapTight>
+            <wp:docPr id="1576535455" name="Picture 2"/>
+            <wp:cNvGraphicFramePr>
+              <a:graphicFrameLocks xmlns:a="http://schemas.openxmlformats.org/drawingml/2006/main" noChangeAspect="1"/>
+            </wp:cNvGraphicFramePr>
+            <a:graphic xmlns:a="http://schemas.openxmlformats.org/drawingml/2006/main">
+              <a:graphicData uri="http://schemas.openxmlformats.org/drawingml/2006/picture">
+                <pic:pic xmlns:pic="http://schemas.openxmlformats.org/drawingml/2006/picture">
+                  <pic:nvPicPr>
+                    <pic:cNvPr id="1576535455" name="Picture 1576535455"/>
+                    <pic:cNvPicPr/>
+                  </pic:nvPicPr>
+                  <pic:blipFill>
+                    <a:blip r:embed="rId7">
+                      <a:extLst>
+                        <a:ext uri="{28A0092B-C50C-407E-A947-70E740481C1C}">
+                          <a14:useLocalDpi xmlns:a14="http://schemas.microsoft.com/office/drawing/2010/main" val="0"/>
+                        </a:ext>
+                      </a:extLst>
+                    </a:blip>
+                    <a:stretch>
+                      <a:fillRect/>
+                    </a:stretch>
+                  </pic:blipFill>
+                  <pic:spPr>
+                    <a:xfrm>
+                      <a:off x="0" y="0"/>
+                      <a:ext cx="5406390" cy="6953250"/>
+                    </a:xfrm>
+                    <a:prstGeom prst="rect">
+                      <a:avLst/>
+                    </a:prstGeom>
+                  </pic:spPr>
+                </pic:pic>
+              </a:graphicData>
+            </a:graphic>
+            <wp14:sizeRelH relativeFrom="page">
+              <wp14:pctWidth>0</wp14:pctWidth>
+            </wp14:sizeRelH>
+            <wp14:sizeRelV relativeFrom="page">
+              <wp14:pctHeight>0</wp14:pctHeight>
+            </wp14:sizeRelV>
+          </wp:anchor>
+        </w:drawing>
+      </w:r>
       <w:r>
         <w:t xml:space="preserve">Once optimized, we must verify the design's performance in real-world units (Newtons, mm, degrees). We do this by calculating the "Typical Error" regions (shown in dark blue), derived directly from the covariance matrix. This matrix summarizes how sensor noise propagates into estimation </w:t>
       </w:r>
@@ -1199,157 +1318,41 @@
         <w:br/>
       </w:r>
       <w:r>
+        <w:lastRenderedPageBreak/>
+        <w:t>The sensor noise floor effectively scales these plots. If we used sensors that were twice as precise, the error magnitude would shrink by half. However, the shape of the error curve</w:t>
+      </w:r>
+      <w:r>
+        <w:t xml:space="preserve">, </w:t>
+      </w:r>
+      <w:r>
+        <w:t>specifically the spike in uncertainty at small separation distances</w:t>
+      </w:r>
+      <w:r>
+        <w:t xml:space="preserve">, </w:t>
+      </w:r>
+      <w:r>
+        <w:t>is dictated by the physical geometry</w:t>
+      </w:r>
+      <w:r>
+        <w:t xml:space="preserve"> of the robot</w:t>
+      </w:r>
+      <w:r>
+        <w:t>, not the sensor quality. Better sensors can reduce the scale of the error, but they cannot change the geometric trends.</w:t>
+      </w:r>
+      <w:r>
         <w:br/>
       </w:r>
       <w:r>
         <w:br/>
       </w:r>
-    </w:p>
-    <w:p>
-      <w:r>
-        <w:rPr>
-          <w:noProof/>
-        </w:rPr>
-        <w:lastRenderedPageBreak/>
-        <w:drawing>
-          <wp:anchor distT="0" distB="0" distL="114300" distR="114300" simplePos="0" relativeHeight="251659264" behindDoc="1" locked="0" layoutInCell="1" allowOverlap="1" wp14:anchorId="12F00EB4" wp14:editId="3B7DF441">
-            <wp:simplePos x="0" y="0"/>
-            <wp:positionH relativeFrom="margin">
-              <wp:posOffset>190500</wp:posOffset>
-            </wp:positionH>
-            <wp:positionV relativeFrom="paragraph">
-              <wp:posOffset>0</wp:posOffset>
-            </wp:positionV>
-            <wp:extent cx="5240020" cy="6739255"/>
-            <wp:effectExtent l="0" t="0" r="0" b="4445"/>
-            <wp:wrapTight wrapText="bothSides">
-              <wp:wrapPolygon edited="0">
-                <wp:start x="0" y="0"/>
-                <wp:lineTo x="0" y="21553"/>
-                <wp:lineTo x="21516" y="21553"/>
-                <wp:lineTo x="21516" y="0"/>
-                <wp:lineTo x="0" y="0"/>
-              </wp:wrapPolygon>
-            </wp:wrapTight>
-            <wp:docPr id="1576535455" name="Picture 2"/>
-            <wp:cNvGraphicFramePr>
-              <a:graphicFrameLocks xmlns:a="http://schemas.openxmlformats.org/drawingml/2006/main" noChangeAspect="1"/>
-            </wp:cNvGraphicFramePr>
-            <a:graphic xmlns:a="http://schemas.openxmlformats.org/drawingml/2006/main">
-              <a:graphicData uri="http://schemas.openxmlformats.org/drawingml/2006/picture">
-                <pic:pic xmlns:pic="http://schemas.openxmlformats.org/drawingml/2006/picture">
-                  <pic:nvPicPr>
-                    <pic:cNvPr id="1576535455" name="Picture 1576535455"/>
-                    <pic:cNvPicPr/>
-                  </pic:nvPicPr>
-                  <pic:blipFill>
-                    <a:blip r:embed="rId6">
-                      <a:extLst>
-                        <a:ext uri="{28A0092B-C50C-407E-A947-70E740481C1C}">
-                          <a14:useLocalDpi xmlns:a14="http://schemas.microsoft.com/office/drawing/2010/main" val="0"/>
-                        </a:ext>
-                      </a:extLst>
-                    </a:blip>
-                    <a:stretch>
-                      <a:fillRect/>
-                    </a:stretch>
-                  </pic:blipFill>
-                  <pic:spPr>
-                    <a:xfrm>
-                      <a:off x="0" y="0"/>
-                      <a:ext cx="5240020" cy="6739255"/>
-                    </a:xfrm>
-                    <a:prstGeom prst="rect">
-                      <a:avLst/>
-                    </a:prstGeom>
-                  </pic:spPr>
-                </pic:pic>
-              </a:graphicData>
-            </a:graphic>
-            <wp14:sizeRelH relativeFrom="page">
-              <wp14:pctWidth>0</wp14:pctWidth>
-            </wp14:sizeRelH>
-            <wp14:sizeRelV relativeFrom="page">
-              <wp14:pctHeight>0</wp14:pctHeight>
-            </wp14:sizeRelV>
-          </wp:anchor>
-        </w:drawing>
-      </w:r>
-    </w:p>
-    <w:p/>
-    <w:p/>
-    <w:p/>
-    <w:p/>
-    <w:p/>
-    <w:p/>
-    <w:p/>
-    <w:p/>
-    <w:p/>
-    <w:p/>
-    <w:p/>
-    <w:p/>
-    <w:p/>
-    <w:p/>
-    <w:p/>
-    <w:p/>
-    <w:p/>
-    <w:p/>
-    <w:p/>
-    <w:p/>
-    <w:p/>
-    <w:p>
-      <w:r>
-        <w:t>The sensor noise floor effectively scales these plots. If we used sensors that were twice as precise, the error magnitude would shrink by half. However, the shape of the error curve</w:t>
-      </w:r>
-      <w:r>
-        <w:t xml:space="preserve">, </w:t>
-      </w:r>
-      <w:r>
-        <w:t>specifically the spike in uncertainty at small separation distances</w:t>
-      </w:r>
-      <w:r>
-        <w:t xml:space="preserve">, </w:t>
-      </w:r>
-      <w:r>
-        <w:t>is dictated by the physical geometry</w:t>
-      </w:r>
-      <w:r>
-        <w:t xml:space="preserve"> of the robot</w:t>
-      </w:r>
-      <w:r>
-        <w:t>, not the sensor quality. Better sensors can reduce the scale of the error, but they cannot change the geometric trends.</w:t>
-      </w:r>
-      <w:r>
-        <w:br/>
-      </w:r>
-      <w:r>
-        <w:lastRenderedPageBreak/>
-        <w:br/>
-      </w:r>
-      <w:r>
-        <w:t xml:space="preserve">Crucially, this prediction is theoretical. It represents a "best-case" baseline assuming the noise is purely random. </w:t>
-      </w:r>
-      <w:proofErr w:type="gramStart"/>
-      <w:r>
-        <w:t>In reality, unmodeled</w:t>
-      </w:r>
-      <w:proofErr w:type="gramEnd"/>
-      <w:r>
-        <w:t xml:space="preserve"> hardware behaviors like drift or </w:t>
+      <w:r>
+        <w:t xml:space="preserve">Crucially, this prediction is theoretical. It represents a "best-case" baseline assuming the noise is purely random. In reality, unmodeled hardware behaviors like drift or </w:t>
       </w:r>
       <w:r>
         <w:t xml:space="preserve">plastic deformation of our robot </w:t>
       </w:r>
       <w:r>
-        <w:t xml:space="preserve">may cause the true experimental error to be higher. These plots show the limits of </w:t>
-      </w:r>
-      <w:proofErr w:type="gramStart"/>
-      <w:r>
-        <w:t>the geometry</w:t>
-      </w:r>
-      <w:proofErr w:type="gramEnd"/>
-      <w:r>
-        <w:t>, serving as</w:t>
+        <w:t>may cause the true experimental error to be higher. These plots show the limits of the geometry, serving as</w:t>
       </w:r>
       <w:r>
         <w:t xml:space="preserve"> </w:t>
@@ -2104,6 +2107,7 @@
   <w:style w:type="character" w:default="1" w:styleId="DefaultParagraphFont">
     <w:name w:val="Default Paragraph Font"/>
     <w:uiPriority w:val="1"/>
+    <w:semiHidden/>
     <w:unhideWhenUsed/>
   </w:style>
   <w:style w:type="table" w:default="1" w:styleId="TableNormal">

</xml_diff>